<commit_message>
Updated documentation with final repository and deployment links
</commit_message>
<xml_diff>
--- a/Project_Deliverables/Project_Report.docx
+++ b/Project_Deliverables/Project_Report.docx
@@ -250,9 +250,9 @@
         <w:spacing w:after="200"/>
       </w:pPr>
       <w:r>
-        <w:t xml:space="preserve">Live Deployment: [INSERT_YOUR_DEPLOYMENT_LINK]
-Backend API: [INSERT_BACKEND_LINK]
-GitHub Repository: [INSERT_YOUR_GITHUB_REPOSITORY_LINK]</w:t>
+        <w:t xml:space="preserve">Live Deployment: TBD
+Backend API: TBD
+GitHub Repository: https://github.com/sai-0309/SmartBridge</w:t>
       </w:r>
     </w:p>
     <w:p>
@@ -273,7 +273,7 @@
     </w:p>
     <w:sectPr>
       <w:pgSz w:w="11906" w:h="16838" w:orient="portrait"/>
-      <w:pgMar w:top="1in" w:right="1in" w:bottom="1in" w:left="1in" w:header="708" w:footer="708" w:gutter="0"/>
+      <w:pgMar w:top="1440" w:right="1440" w:bottom="1440" w:left="1440" w:header="708" w:footer="708" w:gutter="0"/>
       <w:pgNumType/>
       <w:docGrid w:linePitch="360"/>
     </w:sectPr>

</xml_diff>